<commit_message>
barcha hujjatlar uchun to'g'rilab bering
</commit_message>
<xml_diff>
--- a/src/assets/xat blanka.docx
+++ b/src/assets/xat blanka.docx
@@ -436,18 +436,38 @@
                 <w:lang w:val="uz-Latn-UZ" w:eastAsia="ru-RU"/>
               </w:rPr>
             </w:pPr>
-            <w:hyperlink r:id="rId6">
-              <w:r>
-                <w:rPr>
-                  <w:rFonts w:ascii="Times New Roman" w:eastAsia="MS Mincho" w:hAnsi="Times New Roman" w:cs="Times New Roman"/>
-                  <w:color w:val="000000"/>
-                  <w:sz w:val="20"/>
-                  <w:szCs w:val="20"/>
-                  <w:lang w:val="uz-Latn-UZ" w:eastAsia="ru-RU"/>
-                </w:rPr>
-                <w:t>MINISTRY</w:t>
-              </w:r>
-            </w:hyperlink>
+            <w:r>
+              <w:fldChar w:fldCharType="begin"/>
+            </w:r>
+            <w:r>
+              <w:rPr>
+                <w:lang w:val="en-US"/>
+              </w:rPr>
+              <w:instrText xml:space="preserve"> HYPERLINK "http://gov.uz/en/authorities/state_committees/16088" \h </w:instrText>
+            </w:r>
+            <w:r>
+              <w:fldChar w:fldCharType="separate"/>
+            </w:r>
+            <w:r>
+              <w:rPr>
+                <w:rFonts w:ascii="Times New Roman" w:eastAsia="MS Mincho" w:hAnsi="Times New Roman" w:cs="Times New Roman"/>
+                <w:color w:val="000000"/>
+                <w:sz w:val="20"/>
+                <w:szCs w:val="20"/>
+                <w:lang w:val="uz-Latn-UZ" w:eastAsia="ru-RU"/>
+              </w:rPr>
+              <w:t>MINISTRY</w:t>
+            </w:r>
+            <w:r>
+              <w:rPr>
+                <w:rFonts w:ascii="Times New Roman" w:eastAsia="MS Mincho" w:hAnsi="Times New Roman" w:cs="Times New Roman"/>
+                <w:color w:val="000000"/>
+                <w:sz w:val="20"/>
+                <w:szCs w:val="20"/>
+                <w:lang w:val="uz-Latn-UZ" w:eastAsia="ru-RU"/>
+              </w:rPr>
+              <w:fldChar w:fldCharType="end"/>
+            </w:r>
             <w:r>
               <w:rPr>
                 <w:rFonts w:ascii="Times New Roman" w:eastAsia="MS Mincho" w:hAnsi="Times New Roman" w:cs="Times New Roman"/>
@@ -1036,8 +1056,9 @@
           <w:szCs w:val="28"/>
           <w:lang w:val="en-US"/>
         </w:rPr>
-        <w:t xml:space="preserve">body </w:t>
-      </w:r>
+        <w:t>body</w:t>
+      </w:r>
+      <w:proofErr w:type="gramEnd"/>
       <w:r>
         <w:rPr>
           <w:rFonts w:ascii="Times New Roman" w:hAnsi="Times New Roman" w:cs="Times New Roman"/>
@@ -1048,7 +1069,6 @@
         </w:rPr>
         <w:t>}</w:t>
       </w:r>
-      <w:proofErr w:type="gramEnd"/>
     </w:p>
     <w:p>
       <w:pPr>

</xml_diff>

<commit_message>
document qismlarni to'g'rilash kerak bo'ladi
</commit_message>
<xml_diff>
--- a/src/assets/xat blanka.docx
+++ b/src/assets/xat blanka.docx
@@ -436,38 +436,18 @@
                 <w:lang w:val="uz-Latn-UZ" w:eastAsia="ru-RU"/>
               </w:rPr>
             </w:pPr>
-            <w:r>
-              <w:fldChar w:fldCharType="begin"/>
-            </w:r>
-            <w:r>
-              <w:rPr>
-                <w:lang w:val="en-US"/>
-              </w:rPr>
-              <w:instrText xml:space="preserve"> HYPERLINK "http://gov.uz/en/authorities/state_committees/16088" \h </w:instrText>
-            </w:r>
-            <w:r>
-              <w:fldChar w:fldCharType="separate"/>
-            </w:r>
-            <w:r>
-              <w:rPr>
-                <w:rFonts w:ascii="Times New Roman" w:eastAsia="MS Mincho" w:hAnsi="Times New Roman" w:cs="Times New Roman"/>
-                <w:color w:val="000000"/>
-                <w:sz w:val="20"/>
-                <w:szCs w:val="20"/>
-                <w:lang w:val="uz-Latn-UZ" w:eastAsia="ru-RU"/>
-              </w:rPr>
-              <w:t>MINISTRY</w:t>
-            </w:r>
-            <w:r>
-              <w:rPr>
-                <w:rFonts w:ascii="Times New Roman" w:eastAsia="MS Mincho" w:hAnsi="Times New Roman" w:cs="Times New Roman"/>
-                <w:color w:val="000000"/>
-                <w:sz w:val="20"/>
-                <w:szCs w:val="20"/>
-                <w:lang w:val="uz-Latn-UZ" w:eastAsia="ru-RU"/>
-              </w:rPr>
-              <w:fldChar w:fldCharType="end"/>
-            </w:r>
+            <w:hyperlink r:id="rId6">
+              <w:r>
+                <w:rPr>
+                  <w:rFonts w:ascii="Times New Roman" w:eastAsia="MS Mincho" w:hAnsi="Times New Roman" w:cs="Times New Roman"/>
+                  <w:color w:val="000000"/>
+                  <w:sz w:val="20"/>
+                  <w:szCs w:val="20"/>
+                  <w:lang w:val="uz-Latn-UZ" w:eastAsia="ru-RU"/>
+                </w:rPr>
+                <w:t>MINISTRY</w:t>
+              </w:r>
+            </w:hyperlink>
             <w:r>
               <w:rPr>
                 <w:rFonts w:ascii="Times New Roman" w:eastAsia="MS Mincho" w:hAnsi="Times New Roman" w:cs="Times New Roman"/>
@@ -999,7 +979,6 @@
     <w:p>
       <w:pPr>
         <w:spacing w:after="0" w:line="240" w:lineRule="auto"/>
-        <w:ind w:firstLine="709"/>
         <w:jc w:val="both"/>
         <w:rPr>
           <w:rFonts w:ascii="Times New Roman" w:hAnsi="Times New Roman" w:cs="Times New Roman"/>
@@ -1023,12 +1002,7 @@
           <w:lang w:val="en-US"/>
         </w:rPr>
       </w:pPr>
-    </w:p>
-    <w:p>
-      <w:pPr>
-        <w:spacing w:after="0" w:line="240" w:lineRule="auto"/>
-        <w:ind w:firstLine="709"/>
-        <w:jc w:val="both"/>
+      <w:r>
         <w:rPr>
           <w:rFonts w:ascii="Times New Roman" w:hAnsi="Times New Roman" w:cs="Times New Roman"/>
           <w:bCs/>
@@ -1036,7 +1010,8 @@
           <w:szCs w:val="28"/>
           <w:lang w:val="en-US"/>
         </w:rPr>
-      </w:pPr>
+        <w:t>{</w:t>
+      </w:r>
       <w:r>
         <w:rPr>
           <w:rFonts w:ascii="Times New Roman" w:hAnsi="Times New Roman" w:cs="Times New Roman"/>
@@ -1045,9 +1020,8 @@
           <w:szCs w:val="28"/>
           <w:lang w:val="en-US"/>
         </w:rPr>
-        <w:t>{</w:t>
-      </w:r>
-      <w:proofErr w:type="gramStart"/>
+        <w:t>body</w:t>
+      </w:r>
       <w:r>
         <w:rPr>
           <w:rFonts w:ascii="Times New Roman" w:hAnsi="Times New Roman" w:cs="Times New Roman"/>
@@ -1056,229 +1030,8 @@
           <w:szCs w:val="28"/>
           <w:lang w:val="en-US"/>
         </w:rPr>
-        <w:t>body</w:t>
-      </w:r>
-      <w:proofErr w:type="gramEnd"/>
-      <w:r>
-        <w:rPr>
-          <w:rFonts w:ascii="Times New Roman" w:hAnsi="Times New Roman" w:cs="Times New Roman"/>
-          <w:bCs/>
-          <w:sz w:val="28"/>
-          <w:szCs w:val="28"/>
-          <w:lang w:val="en-US"/>
-        </w:rPr>
         <w:t>}</w:t>
       </w:r>
-    </w:p>
-    <w:p>
-      <w:pPr>
-        <w:spacing w:after="0" w:line="240" w:lineRule="auto"/>
-        <w:ind w:firstLine="709"/>
-        <w:jc w:val="both"/>
-        <w:rPr>
-          <w:rFonts w:ascii="Times New Roman" w:hAnsi="Times New Roman" w:cs="Times New Roman"/>
-          <w:bCs/>
-          <w:sz w:val="28"/>
-          <w:szCs w:val="28"/>
-          <w:lang w:val="en-US"/>
-        </w:rPr>
-      </w:pPr>
-    </w:p>
-    <w:p>
-      <w:pPr>
-        <w:spacing w:after="0" w:line="240" w:lineRule="auto"/>
-        <w:ind w:firstLine="709"/>
-        <w:jc w:val="both"/>
-        <w:rPr>
-          <w:rFonts w:ascii="Times New Roman" w:hAnsi="Times New Roman" w:cs="Times New Roman"/>
-          <w:bCs/>
-          <w:sz w:val="28"/>
-          <w:szCs w:val="28"/>
-          <w:lang w:val="en-US"/>
-        </w:rPr>
-      </w:pPr>
-    </w:p>
-    <w:p>
-      <w:pPr>
-        <w:spacing w:after="0" w:line="240" w:lineRule="auto"/>
-        <w:ind w:firstLine="709"/>
-        <w:jc w:val="both"/>
-        <w:rPr>
-          <w:rFonts w:ascii="Times New Roman" w:hAnsi="Times New Roman" w:cs="Times New Roman"/>
-          <w:bCs/>
-          <w:sz w:val="28"/>
-          <w:szCs w:val="28"/>
-          <w:lang w:val="en-US"/>
-        </w:rPr>
-      </w:pPr>
-    </w:p>
-    <w:p>
-      <w:pPr>
-        <w:spacing w:after="0" w:line="240" w:lineRule="auto"/>
-        <w:ind w:firstLine="709"/>
-        <w:jc w:val="both"/>
-        <w:rPr>
-          <w:rFonts w:ascii="Times New Roman" w:hAnsi="Times New Roman" w:cs="Times New Roman"/>
-          <w:bCs/>
-          <w:sz w:val="28"/>
-          <w:szCs w:val="28"/>
-          <w:lang w:val="en-US"/>
-        </w:rPr>
-      </w:pPr>
-    </w:p>
-    <w:p>
-      <w:pPr>
-        <w:spacing w:after="0" w:line="240" w:lineRule="auto"/>
-        <w:ind w:firstLine="709"/>
-        <w:jc w:val="both"/>
-        <w:rPr>
-          <w:rFonts w:ascii="Times New Roman" w:hAnsi="Times New Roman" w:cs="Times New Roman"/>
-          <w:bCs/>
-          <w:sz w:val="28"/>
-          <w:szCs w:val="28"/>
-          <w:lang w:val="en-US"/>
-        </w:rPr>
-      </w:pPr>
-    </w:p>
-    <w:p>
-      <w:pPr>
-        <w:spacing w:after="0" w:line="240" w:lineRule="auto"/>
-        <w:ind w:firstLine="709"/>
-        <w:jc w:val="both"/>
-        <w:rPr>
-          <w:rFonts w:ascii="Times New Roman" w:hAnsi="Times New Roman" w:cs="Times New Roman"/>
-          <w:bCs/>
-          <w:sz w:val="28"/>
-          <w:szCs w:val="28"/>
-          <w:lang w:val="en-US"/>
-        </w:rPr>
-      </w:pPr>
-    </w:p>
-    <w:p>
-      <w:pPr>
-        <w:spacing w:after="0" w:line="240" w:lineRule="auto"/>
-        <w:ind w:firstLine="709"/>
-        <w:jc w:val="both"/>
-        <w:rPr>
-          <w:rFonts w:ascii="Times New Roman" w:hAnsi="Times New Roman" w:cs="Times New Roman"/>
-          <w:bCs/>
-          <w:sz w:val="28"/>
-          <w:szCs w:val="28"/>
-          <w:lang w:val="en-US"/>
-        </w:rPr>
-      </w:pPr>
-    </w:p>
-    <w:p>
-      <w:pPr>
-        <w:spacing w:after="0" w:line="240" w:lineRule="auto"/>
-        <w:ind w:firstLine="709"/>
-        <w:jc w:val="both"/>
-        <w:rPr>
-          <w:rFonts w:ascii="Times New Roman" w:hAnsi="Times New Roman" w:cs="Times New Roman"/>
-          <w:bCs/>
-          <w:sz w:val="28"/>
-          <w:szCs w:val="28"/>
-          <w:lang w:val="en-US"/>
-        </w:rPr>
-      </w:pPr>
-    </w:p>
-    <w:p>
-      <w:pPr>
-        <w:spacing w:after="0" w:line="240" w:lineRule="auto"/>
-        <w:ind w:firstLine="709"/>
-        <w:jc w:val="both"/>
-        <w:rPr>
-          <w:rFonts w:ascii="Times New Roman" w:hAnsi="Times New Roman" w:cs="Times New Roman"/>
-          <w:bCs/>
-          <w:sz w:val="28"/>
-          <w:szCs w:val="28"/>
-          <w:lang w:val="en-US"/>
-        </w:rPr>
-      </w:pPr>
-    </w:p>
-    <w:p>
-      <w:pPr>
-        <w:spacing w:after="0" w:line="240" w:lineRule="auto"/>
-        <w:ind w:firstLine="709"/>
-        <w:jc w:val="both"/>
-        <w:rPr>
-          <w:rFonts w:ascii="Times New Roman" w:hAnsi="Times New Roman" w:cs="Times New Roman"/>
-          <w:bCs/>
-          <w:sz w:val="28"/>
-          <w:szCs w:val="28"/>
-          <w:lang w:val="en-US"/>
-        </w:rPr>
-      </w:pPr>
-    </w:p>
-    <w:p>
-      <w:pPr>
-        <w:spacing w:after="0" w:line="240" w:lineRule="auto"/>
-        <w:ind w:firstLine="709"/>
-        <w:jc w:val="both"/>
-        <w:rPr>
-          <w:rFonts w:ascii="Times New Roman" w:hAnsi="Times New Roman" w:cs="Times New Roman"/>
-          <w:bCs/>
-          <w:sz w:val="28"/>
-          <w:szCs w:val="28"/>
-          <w:lang w:val="en-US"/>
-        </w:rPr>
-      </w:pPr>
-    </w:p>
-    <w:p>
-      <w:pPr>
-        <w:spacing w:after="0" w:line="240" w:lineRule="auto"/>
-        <w:ind w:firstLine="709"/>
-        <w:jc w:val="both"/>
-        <w:rPr>
-          <w:rFonts w:ascii="Times New Roman" w:hAnsi="Times New Roman" w:cs="Times New Roman"/>
-          <w:bCs/>
-          <w:sz w:val="28"/>
-          <w:szCs w:val="28"/>
-          <w:lang w:val="en-US"/>
-        </w:rPr>
-      </w:pPr>
-    </w:p>
-    <w:p>
-      <w:pPr>
-        <w:spacing w:after="0" w:line="240" w:lineRule="auto"/>
-        <w:ind w:firstLine="709"/>
-        <w:jc w:val="both"/>
-        <w:rPr>
-          <w:rFonts w:ascii="Times New Roman" w:hAnsi="Times New Roman" w:cs="Times New Roman"/>
-          <w:bCs/>
-          <w:sz w:val="28"/>
-          <w:szCs w:val="28"/>
-          <w:lang w:val="en-US"/>
-        </w:rPr>
-      </w:pPr>
-    </w:p>
-    <w:p>
-      <w:pPr>
-        <w:spacing w:after="0" w:line="240" w:lineRule="auto"/>
-        <w:ind w:firstLine="709"/>
-        <w:jc w:val="both"/>
-        <w:rPr>
-          <w:rFonts w:ascii="Times New Roman" w:hAnsi="Times New Roman" w:cs="Times New Roman"/>
-          <w:bCs/>
-          <w:sz w:val="28"/>
-          <w:szCs w:val="28"/>
-          <w:lang w:val="en-US"/>
-        </w:rPr>
-      </w:pPr>
-    </w:p>
-    <w:p>
-      <w:pPr>
-        <w:spacing w:after="0" w:line="240" w:lineRule="auto"/>
-        <w:ind w:firstLine="709"/>
-        <w:jc w:val="both"/>
-        <w:rPr>
-          <w:rFonts w:ascii="Times New Roman" w:hAnsi="Times New Roman" w:cs="Times New Roman"/>
-          <w:bCs/>
-          <w:sz w:val="28"/>
-          <w:szCs w:val="28"/>
-          <w:lang w:val="en-US"/>
-        </w:rPr>
-      </w:pPr>
     </w:p>
     <w:p>
       <w:pPr>

</xml_diff>